<commit_message>
Tome 3 : corrige les tics résiduels signalés par le 3e passage jury
Élimine le gabarit « dit X, songeur/songeuse » (13 occurrences sur 4
personnages), le doublon exact « petit rire fatigué », et le cluster
« marqua une pause » / « balaya la salle du regard » du chapitre 7 —
défauts que le dernier passage jury (8,3/10) avait notés comme non
résolus avant que le manuscrit ne soit finalisé. Vérifié par une passe
de relecture ciblée, manuscrit et .docx régénérés.

Co-Authored-By: Claude Sonnet 5 <noreply@anthropic.com>
Claude-Session: https://claude.ai/code/session_01XTzMQsRKiLwP4ARcJJGDCc
</commit_message>
<xml_diff>
--- a/tome-03-locean-qui-avait-de-la-fievre/Sofia-et-Souly-Tome-3-L-Ocean-qui-avait-de-la-fievre.docx
+++ b/tome-03-locean-qui-avait-de-la-fievre/Sofia-et-Souly-Tome-3-L-Ocean-qui-avait-de-la-fievre.docx
@@ -2489,7 +2489,7 @@
           <w:rFonts w:ascii="Georgia" w:hAnsi="Georgia"/>
           <w:sz w:val="23"/>
         </w:rPr>
-        <w:t>— Et quelqu'un peut le casser en une nuit, dit Souly, songeur.</w:t>
+        <w:t>— Et quelqu'un peut le casser en une nuit, dit Souly, en observant l'eau sans vraiment la voir.</w:t>
       </w:r>
     </w:p>
     <w:p>
@@ -2541,7 +2541,7 @@
           <w:rFonts w:ascii="Georgia" w:hAnsi="Georgia"/>
           <w:sz w:val="23"/>
         </w:rPr>
-        <w:t>— Donc c'est pas juste une histoire de jolis poissons colorés, dit Sofia, songeuse.</w:t>
+        <w:t>— Donc c'est pas juste une histoire de jolis poissons colorés, dit Sofia, en prenant son temps.</w:t>
       </w:r>
     </w:p>
     <w:p>
@@ -2593,7 +2593,7 @@
           <w:rFonts w:ascii="Georgia" w:hAnsi="Georgia"/>
           <w:sz w:val="23"/>
         </w:rPr>
-        <w:t>— C'est un peu comme nous, dit Souly, songeur. Personne d'autre n'enquêtait vraiment sur les trucs bizarres de notre quartier, alors on a commencé.</w:t>
+        <w:t>— C'est un peu comme nous, remarqua Souly. Personne d'autre n'enquêtait vraiment sur les trucs bizarres de notre quartier, alors on a commencé.</w:t>
       </w:r>
     </w:p>
     <w:p>
@@ -4304,7 +4304,7 @@
           <w:rFonts w:ascii="Georgia" w:hAnsi="Georgia"/>
           <w:sz w:val="23"/>
         </w:rPr>
-        <w:t>— Ça, dit Noah, songeur, mon père dirait exactement la même chose. Sauf que lui, il le fait dans sa tête, jamais sur papier.</w:t>
+        <w:t>— Ça, dit Noah après un instant, mon père dirait exactement la même chose. Sauf que lui, il le fait dans sa tête, jamais sur papier.</w:t>
       </w:r>
     </w:p>
     <w:p>
@@ -4865,7 +4865,7 @@
           <w:rFonts w:ascii="Georgia" w:hAnsi="Georgia"/>
           <w:sz w:val="23"/>
         </w:rPr>
-        <w:t>— On n'a jamais de moment comme ça, nous, dit Sofia, presque songeuse. À Paris, il y a toujours quelqu'un. Le voisin du dessus, la queue à la boulangerie, tout le monde.</w:t>
+        <w:t>— On n'a jamais de moment comme ça, nous, dit Sofia, la voix radoucie. À Paris, il y a toujours quelqu'un. Le voisin du dessus, la queue à la boulangerie, tout le monde.</w:t>
       </w:r>
     </w:p>
     <w:p>
@@ -7096,7 +7096,7 @@
           <w:rFonts w:ascii="Georgia" w:hAnsi="Georgia"/>
           <w:sz w:val="23"/>
         </w:rPr>
-        <w:t>Sofia plongea la tête sous l'eau une dernière fois, observant longuement la ligne nette qui séparait le récif vivant du désastre voisin, avant de remonter, songeuse.</w:t>
+        <w:t>Sofia plongea la tête sous l'eau une dernière fois, observant longuement la ligne nette qui séparait le récif vivant du désastre voisin, avant de remonter, sourcils froncés.</w:t>
       </w:r>
     </w:p>
     <w:p>
@@ -9119,7 +9119,7 @@
           <w:rFonts w:ascii="Georgia" w:hAnsi="Georgia"/>
           <w:sz w:val="23"/>
         </w:rPr>
-        <w:t>— La plupart des bateaux privés étaient amarrés pour la fête, dit Noah, songeur. Tout le monde était sur la promenade, pas sur l'eau. Les vedettes de la capitainerie ne sortent jamais la nuit sans une bonne raison. Et l'hôtel ferme ses activités nautiques à dix-huit heures pile, mon oncle y travaille, je le sais par cœur.</w:t>
+        <w:t>— La plupart des bateaux privés étaient amarrés pour la fête, dit Noah. Tout le monde était sur la promenade, pas sur l'eau. Les vedettes de la capitainerie ne sortent jamais la nuit sans une bonne raison. Et l'hôtel ferme ses activités nautiques à dix-huit heures pile, mon oncle y travaille, je le sais par cœur.</w:t>
       </w:r>
     </w:p>
     <w:p>
@@ -9145,7 +9145,7 @@
           <w:rFonts w:ascii="Georgia" w:hAnsi="Georgia"/>
           <w:sz w:val="23"/>
         </w:rPr>
-        <w:t>Un silence suivit, plus lourd que les précédents.</w:t>
+        <w:t>Personne ne répondit tout de suite ; le poids de ce nom-là était plus lourd que les précédents.</w:t>
       </w:r>
     </w:p>
     <w:p>
@@ -9418,7 +9418,7 @@
           <w:rFonts w:ascii="Georgia" w:hAnsi="Georgia"/>
           <w:sz w:val="23"/>
         </w:rPr>
-        <w:t>Fara hocha la tête, songeuse, en repoussant sa tasse de café refroidie depuis longtemps.</w:t>
+        <w:t>Fara hocha lentement la tête, en repoussant sa tasse de café refroidie depuis longtemps.</w:t>
       </w:r>
     </w:p>
     <w:p>
@@ -10137,7 +10137,7 @@
           <w:rFonts w:ascii="Georgia" w:hAnsi="Georgia"/>
           <w:sz w:val="23"/>
         </w:rPr>
-        <w:t>Elle marqua une pause, consultant ses notes posées sur le pupitre, avant de reprendre d'une voix un peu plus hésitante.</w:t>
+        <w:t>Elle s'arrêta un instant, consultant ses notes posées sur le pupitre, avant de reprendre d'une voix un peu plus hésitante.</w:t>
       </w:r>
     </w:p>
     <w:p>
@@ -10399,7 +10399,7 @@
           <w:rFonts w:ascii="Georgia" w:hAnsi="Georgia"/>
           <w:sz w:val="23"/>
         </w:rPr>
-        <w:t>Un silence tendu s'installa un instant dans la salle, chacun attendant de voir qui oserait parler le premier, avant qu'une voix ne s'élève, ferme et posée.</w:t>
+        <w:t>La salle resta muette un instant, chacun attendant de voir qui oserait parler le premier, avant qu'une voix ne s'élève, ferme et posée.</w:t>
       </w:r>
     </w:p>
     <w:p>
@@ -10843,7 +10843,7 @@
           <w:rFonts w:ascii="Georgia" w:hAnsi="Georgia"/>
           <w:sz w:val="23"/>
         </w:rPr>
-        <w:t>Il marqua une pause, ses yeux balayant lentement la salle, s'arrêtant un instant sur chaque visage familier.</w:t>
+        <w:t>Il laissa son regard glisser lentement sur la salle, s'arrêtant un instant sur chaque visage familier.</w:t>
       </w:r>
     </w:p>
     <w:p>
@@ -10936,7 +10936,7 @@
           <w:rFonts w:ascii="Georgia" w:hAnsi="Georgia"/>
           <w:sz w:val="23"/>
         </w:rPr>
-        <w:t>La mairesse balaya la salle du regard, cherchant visiblement d'autres mains levées avant de continuer, dans l'espoir manifeste de retrouver un semblant de contrôle sur le déroulement de la soirée.</w:t>
+        <w:t>La mairesse chercha des yeux d'autres mains levées avant de continuer, dans l'espoir manifeste de retrouver un semblant de contrôle sur le déroulement de la soirée.</w:t>
       </w:r>
     </w:p>
     <w:p>
@@ -12461,7 +12461,7 @@
           <w:rFonts w:ascii="Georgia" w:hAnsi="Georgia"/>
           <w:sz w:val="23"/>
         </w:rPr>
-        <w:t>— Un motif de plus en plus difficile à expliquer par le hasard, dit Fara, songeuse, en refermant son carnet de terrain.</w:t>
+        <w:t>— Un motif de plus en plus difficile à expliquer par le hasard, dit Fara, en refermant son carnet de terrain.</w:t>
       </w:r>
     </w:p>
     <w:p>
@@ -12723,7 +12723,7 @@
           <w:rFonts w:ascii="Georgia" w:hAnsi="Georgia"/>
           <w:sz w:val="23"/>
         </w:rPr>
-        <w:t>— Le bureau de Christophe donne directement sur le ponton, remarqua Noah, songeur. Si quelqu'un discutait près de la fenêtre ouverte, à cette heure-là...</w:t>
+        <w:t>— Le bureau de Christophe donne directement sur le ponton, remarqua Noah. Si quelqu'un discutait près de la fenêtre ouverte, à cette heure-là...</w:t>
       </w:r>
     </w:p>
     <w:p>
@@ -13349,7 +13349,7 @@
           <w:rFonts w:ascii="Georgia" w:hAnsi="Georgia"/>
           <w:sz w:val="23"/>
         </w:rPr>
-        <w:t>— C'est exactement la différence entre toi et moi, dit Souly, songeur.</w:t>
+        <w:t>— C'est exactement la différence entre toi et moi, dit Souly, plus pour lui-même que pour elle.</w:t>
       </w:r>
     </w:p>
     <w:p>
@@ -14382,7 +14382,7 @@
           <w:rFonts w:ascii="Georgia" w:hAnsi="Georgia"/>
           <w:sz w:val="23"/>
         </w:rPr>
-        <w:t>Malgré lui, malgré le froid, malgré la nuit qu'il venait de vivre, le jeune capitaine laissa échapper un petit rire fatigué.</w:t>
+        <w:t>Malgré lui, malgré le froid, malgré la nuit qu'il venait de vivre, le jeune capitaine laissa échapper un souffle qui ressemblait, presque, à un rire.</w:t>
       </w:r>
     </w:p>
     <w:p>
@@ -15203,7 +15203,7 @@
           <w:rFonts w:ascii="Georgia" w:hAnsi="Georgia"/>
           <w:sz w:val="23"/>
         </w:rPr>
-        <w:t>— Depuis combien de temps recevez-vous ces instructions ? demanda l'officier, sans lever les yeux de son carnet de notes.</w:t>
+        <w:t>— Depuis combien de temps recevez-vous ces instructions ? demanda l'officier, le regard toujours rivé sur son carnet de notes.</w:t>
       </w:r>
     </w:p>
     <w:p>
@@ -17230,7 +17230,7 @@
           <w:rFonts w:ascii="Georgia" w:hAnsi="Georgia"/>
           <w:sz w:val="23"/>
         </w:rPr>
-        <w:t>— C'est marrant, dit Souly, songeur, depuis son pupitre. Tout le monde pensait que c'était soit une superstition à ignorer, soit une vérité à suivre aveuglément. Personne n'avait pensé à juste... vérifier.</w:t>
+        <w:t>— C'est marrant, dit Souly depuis son pupitre. Tout le monde pensait que c'était soit une superstition à ignorer, soit une vérité à suivre aveuglément. Personne n'avait pensé à juste... vérifier.</w:t>
       </w:r>
     </w:p>
     <w:p>
@@ -18473,7 +18473,7 @@
           <w:rFonts w:ascii="Georgia" w:hAnsi="Georgia"/>
           <w:sz w:val="23"/>
         </w:rPr>
-        <w:t>— On a fait quoi, en vrai, ces deux semaines ? demanda-t-elle, soudain plus songeuse que d'habitude. On est juste venus en vacances, et on a fini par... tout ça.</w:t>
+        <w:t>— On a fait quoi, en vrai, ces deux semaines ? demanda-t-elle, soudain plus grave que d'habitude. On est juste venus en vacances, et on a fini par... tout ça.</w:t>
       </w:r>
     </w:p>
     <w:p>

</xml_diff>